<commit_message>
Update CAMS Q1 study note with full conversation content
Added from Q1 discussion:
- TF vs ML comparison table (direction of money flow)
- NRA vs RBA distinction (Assessment vs Approach)
- NRA memory trick (国の健康診断書)
- FATF R.1 trap patterns in CAMS exam
- CAMS exam scope overview (FATF/US/EU/Japan)

https://claude.ai/code/session_01UAH8Vfbnfe2YUzgAwoZFTi
</commit_message>
<xml_diff>
--- a/study-notes/CAMS_Q01_人身取引レッドフラッグ.docx
+++ b/study-notes/CAMS_Q01_人身取引レッドフラッグ.docx
@@ -109,6 +109,16 @@
       </w:pPr>
       <w:r>
         <w:t>🔗 CAMS × 日本AML 比較</w:t>
+      </w:r>
+    </w:p>
+    <w:p>
+      <w:r>
+        <w:t>■ 仕組み（レッドフラッグの考え方）は日本もCAMSも同じ</w:t>
+      </w:r>
+    </w:p>
+    <w:p>
+      <w:r>
+        <w:t>■ ただし具体的な現れ方が異なる：</w:t>
       </w:r>
     </w:p>
     <w:tbl>
@@ -315,11 +325,16 @@
     </w:tbl>
     <w:p/>
     <w:p>
+      <w:r>
+        <w:t>━━━━━━━━━━━━━━━━━━━━━━━━━━━━━━━━━━━━━━━━━━━━━━━━━━</w:t>
+      </w:r>
+    </w:p>
+    <w:p>
       <w:pPr>
         <w:pStyle w:val="Heading2"/>
       </w:pPr>
       <w:r>
-        <w:t>📚 関連用語</w:t>
+        <w:t>📚 Q1から広がった関連知識</w:t>
       </w:r>
     </w:p>
     <w:p>
@@ -332,7 +347,7 @@
     </w:p>
     <w:p>
       <w:r>
-        <w:t>テロ行為を実行するために資金を集めたり提供したりすること。MLとの最大の違いは「合法的な資金でもTFに該当しうる」点。少額の給与や寄付がテロ組織に流れるケースがあり、取引モニタリングで検知が困難。</w:t>
+        <w:t>テロ行為を実行するために資金を集めたり提供したりすること。</w:t>
       </w:r>
     </w:p>
     <w:tbl>
@@ -361,7 +376,7 @@
           </w:tcPr>
           <w:p>
             <w:r>
-              <w:t>ML</w:t>
+              <w:t>ML（マネー・ローンダリング）</w:t>
             </w:r>
           </w:p>
         </w:tc>
@@ -371,7 +386,7 @@
           </w:tcPr>
           <w:p>
             <w:r>
-              <w:t>TF</w:t>
+              <w:t>TF（テロ資金供与）</w:t>
             </w:r>
           </w:p>
         </w:tc>
@@ -393,7 +408,7 @@
           </w:tcPr>
           <w:p>
             <w:r>
-              <w:t>汚い金→きれいに見せる</w:t>
+              <w:t>汚い金 → きれいに見せる</w:t>
             </w:r>
           </w:p>
         </w:tc>
@@ -403,7 +418,7 @@
           </w:tcPr>
           <w:p>
             <w:r>
-              <w:t>きれいな金→テロに使う</w:t>
+              <w:t>きれいな金 → テロに使う</w:t>
             </w:r>
           </w:p>
         </w:tc>
@@ -440,7 +455,77 @@
           </w:p>
         </w:tc>
       </w:tr>
+      <w:tr>
+        <w:tc>
+          <w:tcPr>
+            <w:tcW w:type="dxa" w:w="2880"/>
+          </w:tcPr>
+          <w:p>
+            <w:r>
+              <w:t>金額</w:t>
+            </w:r>
+          </w:p>
+        </w:tc>
+        <w:tc>
+          <w:tcPr>
+            <w:tcW w:type="dxa" w:w="2880"/>
+          </w:tcPr>
+          <w:p>
+            <w:r>
+              <w:t>大きいことが多い</w:t>
+            </w:r>
+          </w:p>
+        </w:tc>
+        <w:tc>
+          <w:tcPr>
+            <w:tcW w:type="dxa" w:w="2880"/>
+          </w:tcPr>
+          <w:p>
+            <w:r>
+              <w:t>少額でもテロは実行できる</w:t>
+            </w:r>
+          </w:p>
+        </w:tc>
+      </w:tr>
+      <w:tr>
+        <w:tc>
+          <w:tcPr>
+            <w:tcW w:type="dxa" w:w="2880"/>
+          </w:tcPr>
+          <w:p>
+            <w:r>
+              <w:t>検知</w:t>
+            </w:r>
+          </w:p>
+        </w:tc>
+        <w:tc>
+          <w:tcPr>
+            <w:tcW w:type="dxa" w:w="2880"/>
+          </w:tcPr>
+          <w:p>
+            <w:r>
+              <w:t>取引パターンで検知しやすい</w:t>
+            </w:r>
+          </w:p>
+        </w:tc>
+        <w:tc>
+          <w:tcPr>
+            <w:tcW w:type="dxa" w:w="2880"/>
+          </w:tcPr>
+          <w:p>
+            <w:r>
+              <w:t>少額・合法資金で検知が非常に困難</w:t>
+            </w:r>
+          </w:p>
+        </w:tc>
+      </w:tr>
     </w:tbl>
+    <w:p/>
+    <w:p>
+      <w:r>
+        <w:t>覚え方: ML = 汚い金を洗う / TF = きれいな金を汚く使う → 方向が逆</w:t>
+      </w:r>
+    </w:p>
     <w:p>
       <w:pPr>
         <w:pStyle w:val="Heading3"/>
@@ -454,19 +539,336 @@
         <w:t>日本政府（国家公安委員会）が国全体のML/TFリスクを評価して毎年公表する文書。FATF勧告1が各国にリスク評価の実施を義務付けており、NRAはその日本版。金融機関はNRAを参照して自社のリスク評価に活用することが求められる。</w:t>
       </w:r>
     </w:p>
+    <w:p/>
+    <w:p>
+      <w:r>
+        <w:t>⚠️ 間違えやすいポイント:</w:t>
+      </w:r>
+    </w:p>
+    <w:tbl>
+      <w:tblPr>
+        <w:tblStyle w:val="TableGrid"/>
+        <w:tblW w:type="auto" w:w="0"/>
+        <w:tblLook w:firstColumn="1" w:firstRow="1" w:lastColumn="0" w:lastRow="0" w:noHBand="0" w:noVBand="1" w:val="04A0"/>
+      </w:tblPr>
+      <w:tblGrid>
+        <w:gridCol w:w="2880"/>
+        <w:gridCol w:w="2880"/>
+        <w:gridCol w:w="2880"/>
+      </w:tblGrid>
+      <w:tr>
+        <w:tc>
+          <w:tcPr>
+            <w:tcW w:type="dxa" w:w="2880"/>
+          </w:tcPr>
+          <w:p>
+            <w:r>
+              <w:t>略語</w:t>
+            </w:r>
+          </w:p>
+        </w:tc>
+        <w:tc>
+          <w:tcPr>
+            <w:tcW w:type="dxa" w:w="2880"/>
+          </w:tcPr>
+          <w:p>
+            <w:r>
+              <w:t>正式名</w:t>
+            </w:r>
+          </w:p>
+        </w:tc>
+        <w:tc>
+          <w:tcPr>
+            <w:tcW w:type="dxa" w:w="2880"/>
+          </w:tcPr>
+          <w:p>
+            <w:r>
+              <w:t>意味</w:t>
+            </w:r>
+          </w:p>
+        </w:tc>
+      </w:tr>
+      <w:tr>
+        <w:tc>
+          <w:tcPr>
+            <w:tcW w:type="dxa" w:w="2880"/>
+          </w:tcPr>
+          <w:p>
+            <w:r>
+              <w:t>NRA</w:t>
+            </w:r>
+          </w:p>
+        </w:tc>
+        <w:tc>
+          <w:tcPr>
+            <w:tcW w:type="dxa" w:w="2880"/>
+          </w:tcPr>
+          <w:p>
+            <w:r>
+              <w:t>National Risk Assessment</w:t>
+            </w:r>
+          </w:p>
+        </w:tc>
+        <w:tc>
+          <w:tcPr>
+            <w:tcW w:type="dxa" w:w="2880"/>
+          </w:tcPr>
+          <w:p>
+            <w:r>
+              <w:t>リスクを「調べる・知る」＝評価</w:t>
+            </w:r>
+          </w:p>
+        </w:tc>
+      </w:tr>
+      <w:tr>
+        <w:tc>
+          <w:tcPr>
+            <w:tcW w:type="dxa" w:w="2880"/>
+          </w:tcPr>
+          <w:p>
+            <w:r>
+              <w:t>RBA</w:t>
+            </w:r>
+          </w:p>
+        </w:tc>
+        <w:tc>
+          <w:tcPr>
+            <w:tcW w:type="dxa" w:w="2880"/>
+          </w:tcPr>
+          <w:p>
+            <w:r>
+              <w:t>Risk-Based Approach</w:t>
+            </w:r>
+          </w:p>
+        </w:tc>
+        <w:tc>
+          <w:tcPr>
+            <w:tcW w:type="dxa" w:w="2880"/>
+          </w:tcPr>
+          <w:p>
+            <w:r>
+              <w:t>リスクに「対応する」＝対策</w:t>
+            </w:r>
+          </w:p>
+        </w:tc>
+      </w:tr>
+    </w:tbl>
+    <w:p/>
+    <w:p>
+      <w:r>
+        <w:t>覚え方:</w:t>
+      </w:r>
+    </w:p>
+    <w:p>
+      <w:r>
+        <w:t xml:space="preserve">  NRA = 国の健康診断書（どこが悪いか調べる）→ Assessment = 評価・調査</w:t>
+      </w:r>
+    </w:p>
+    <w:p>
+      <w:r>
+        <w:t xml:space="preserve">  RBA = 治療方針（悪いところに集中して治す）→ Approach = 対応</w:t>
+      </w:r>
+    </w:p>
+    <w:p>
+      <w:r>
+        <w:t xml:space="preserve">  順番: NRA（まず知る）→ RBA（次に対応する）</w:t>
+      </w:r>
+    </w:p>
+    <w:p/>
+    <w:p>
+      <w:r>
+        <w:t>CAMSでの問われ方: 「なぜNRAが必要か？」</w:t>
+      </w:r>
+    </w:p>
+    <w:p>
+      <w:r>
+        <w:t xml:space="preserve">  ① RBAの出発点（リスクを知らなければ守れない）</w:t>
+      </w:r>
+    </w:p>
+    <w:p>
+      <w:r>
+        <w:t xml:space="preserve">  ② 国ごとにリスクが違う（日本＝現金社会、米国＝薬物カルテル等）</w:t>
+      </w:r>
+    </w:p>
+    <w:p>
+      <w:r>
+        <w:t xml:space="preserve">  ③ FATF相互審査IO.1で評価される（不十分→グレーリスト）</w:t>
+      </w:r>
+    </w:p>
     <w:p>
       <w:pPr>
         <w:pStyle w:val="Heading3"/>
       </w:pPr>
       <w:r>
-        <w:t>FATF勧告1（R.1）= リスク評価とRBA</w:t>
+        <w:t>FATF勧告1（R.1）= 40の勧告の「1番目」</w:t>
       </w:r>
     </w:p>
     <w:p>
       <w:r>
-        <w:t>FATF 40の勧告の文字通り1番目。2012年改訂で「リスク評価とRBAの適用」が勧告1に据えられた。「まずリスクを知れ。それが全ての出発点」というFATFのメッセージ。旧版ではR.1はML犯罪化だったが、現行版ではR.3に移動。CAMS試験での引っ掛けポイント。</w:t>
+        <w:t>2012年改訂で「リスク評価とRBAの適用」が勧告1に据えられた。40本ある勧告の文字通り1番目。「まずリスクを知れ。それが全ての出発点」というFATFのメッセージ。</w:t>
       </w:r>
     </w:p>
+    <w:p/>
+    <w:p>
+      <w:r>
+        <w:t>CAMS試験での引っ掛け:</w:t>
+      </w:r>
+    </w:p>
+    <w:p>
+      <w:r>
+        <w:t xml:space="preserve">  ❌ R.1 = ML犯罪化 → それはR.3（旧版のR.1と混同させる罠）</w:t>
+      </w:r>
+    </w:p>
+    <w:p>
+      <w:r>
+        <w:t xml:space="preserve">  ❌ R.1 = CDD要件 → それはR.10</w:t>
+      </w:r>
+    </w:p>
+    <w:p>
+      <w:r>
+        <w:t xml:space="preserve">  ❌ R.1 = UBO透明性 → それはR.24/25</w:t>
+      </w:r>
+    </w:p>
+    <w:p>
+      <w:r>
+        <w:t xml:space="preserve">  ✅ R.1 = リスク評価とRBA</w:t>
+      </w:r>
+    </w:p>
+    <w:p>
+      <w:pPr>
+        <w:pStyle w:val="Heading3"/>
+      </w:pPr>
+      <w:r>
+        <w:t>CAMSの出題構造（Q1で確認した全体像）</w:t>
+      </w:r>
+    </w:p>
+    <w:p>
+      <w:r>
+        <w:t>CAMSは米国中心だが「国際基準として」問われる。</w:t>
+      </w:r>
+    </w:p>
+    <w:tbl>
+      <w:tblPr>
+        <w:tblStyle w:val="TableGrid"/>
+        <w:tblW w:type="auto" w:w="0"/>
+        <w:tblLook w:firstColumn="1" w:firstRow="1" w:lastColumn="0" w:lastRow="0" w:noHBand="0" w:noVBand="1" w:val="04A0"/>
+      </w:tblPr>
+      <w:tblGrid>
+        <w:gridCol w:w="4320"/>
+        <w:gridCol w:w="4320"/>
+      </w:tblGrid>
+      <w:tr>
+        <w:tc>
+          <w:tcPr>
+            <w:tcW w:type="dxa" w:w="4320"/>
+          </w:tcPr>
+          <w:p>
+            <w:r>
+              <w:t>見たキーワード</w:t>
+            </w:r>
+          </w:p>
+        </w:tc>
+        <w:tc>
+          <w:tcPr>
+            <w:tcW w:type="dxa" w:w="4320"/>
+          </w:tcPr>
+          <w:p>
+            <w:r>
+              <w:t>こう考える</w:t>
+            </w:r>
+          </w:p>
+        </w:tc>
+      </w:tr>
+      <w:tr>
+        <w:tc>
+          <w:tcPr>
+            <w:tcW w:type="dxa" w:w="4320"/>
+          </w:tcPr>
+          <w:p>
+            <w:r>
+              <w:t>FATF勧告、RBA、CDD、EDD、PEP</w:t>
+            </w:r>
+          </w:p>
+        </w:tc>
+        <w:tc>
+          <w:tcPr>
+            <w:tcW w:type="dxa" w:w="4320"/>
+          </w:tcPr>
+          <w:p>
+            <w:r>
+              <w:t>国際共通 → CAMS ✅ 日本AML ✅ 両方出る</w:t>
+            </w:r>
+          </w:p>
+        </w:tc>
+      </w:tr>
+      <w:tr>
+        <w:tc>
+          <w:tcPr>
+            <w:tcW w:type="dxa" w:w="4320"/>
+          </w:tcPr>
+          <w:p>
+            <w:r>
+              <w:t>USA PATRIOT Act、OFAC、FinCEN</w:t>
+            </w:r>
+          </w:p>
+        </w:tc>
+        <w:tc>
+          <w:tcPr>
+            <w:tcW w:type="dxa" w:w="4320"/>
+          </w:tcPr>
+          <w:p>
+            <w:r>
+              <w:t>米国固有 → CAMS ✅ のみ</w:t>
+            </w:r>
+          </w:p>
+        </w:tc>
+      </w:tr>
+      <w:tr>
+        <w:tc>
+          <w:tcPr>
+            <w:tcW w:type="dxa" w:w="4320"/>
+          </w:tcPr>
+          <w:p>
+            <w:r>
+              <w:t>AMLD、GDPR、CJEU判決</w:t>
+            </w:r>
+          </w:p>
+        </w:tc>
+        <w:tc>
+          <w:tcPr>
+            <w:tcW w:type="dxa" w:w="4320"/>
+          </w:tcPr>
+          <w:p>
+            <w:r>
+              <w:t>EU固有 → CAMS ✅ のみ</w:t>
+            </w:r>
+          </w:p>
+        </w:tc>
+      </w:tr>
+      <w:tr>
+        <w:tc>
+          <w:tcPr>
+            <w:tcW w:type="dxa" w:w="4320"/>
+          </w:tcPr>
+          <w:p>
+            <w:r>
+              <w:t>犯収法、金融庁GL、JAFIC、NRA</w:t>
+            </w:r>
+          </w:p>
+        </w:tc>
+        <w:tc>
+          <w:tcPr>
+            <w:tcW w:type="dxa" w:w="4320"/>
+          </w:tcPr>
+          <w:p>
+            <w:r>
+              <w:t>日本固有 → 日本AML ✅ のみ</w:t>
+            </w:r>
+          </w:p>
+        </w:tc>
+      </w:tr>
+    </w:tbl>
+    <w:p/>
     <w:p>
       <w:r>
         <w:t>━━━━━━━━━━━━━━━━━━━━━━━━━━━━━━━━━━━━━━━━━━━━━━━━━━</w:t>
@@ -493,6 +895,11 @@
     <w:p>
       <w:r>
         <w:t>• CAMS Q33: FATF勧告1の内容</w:t>
+      </w:r>
+    </w:p>
+    <w:p>
+      <w:r>
+        <w:t>• CAMS Q51: RBAの基本原則</w:t>
       </w:r>
     </w:p>
     <w:p>

</xml_diff>